<commit_message>
oct-22 paper: reference Fig. 3, separate it from Fig. 2, author block in Frank's style
The reasoning-output figure (Fig. 3) was never cited in the text and
floated to the top of page 4 directly under Fig. 2. The paragraph that
describes the JSON record now cites it, and the float is placed at the
bottom of the page, so the paragraph sits between the two figures.

Author block follows Frank's AIPR 2025 paper: superscript 1, 2, 3 on the
names with ORCIDs, and one affiliation line per author (Innodata,
Physical AI Intern; Innodata, Robotics and Physical AI Solutions
Architect; Innodata, VP Robotics and Computer Vision). The envelope mark
and the corresponding-author email are removed. Markdown updated to match.
</commit_message>
<xml_diff>
--- a/oct-22/AIPR 2026 Paper-oct22.docx
+++ b/oct-22/AIPR 2026 Paper-oct22.docx
@@ -16,7 +16,7 @@
         <w:pStyle w:val="FirstParagraph"/>
       </w:pPr>
       <w:r>
-        <w:t xml:space="preserve">Shrey Jha (corresponding author, ORCID 0009-0003-5044-4187), Skyler Saucedo (ORCID 0009-0005-7005-7736), and Franklin Tanner (ORCID 0009-0003-6814-2291)</w:t>
+        <w:t xml:space="preserve">Shrey Jha¹ (ORCID 0009-0003-5044-4187), Skyler Saucedo² (ORCID 0009-0005-7005-7736), and Franklin Tanner³ (ORCID 0009-0003-6814-2291)</w:t>
       </w:r>
     </w:p>
     <w:p>
@@ -24,7 +24,19 @@
         <w:pStyle w:val="BodyText"/>
       </w:pPr>
       <w:r>
-        <w:t xml:space="preserve">Innodata [VERIFY: city, country]. Corresponding author: Shrey_Jha@innodata.net</w:t>
+        <w:t xml:space="preserve">¹ Innodata, Physical AI Intern</w:t>
+      </w:r>
+      <w:r>
+        <w:t xml:space="preserve"> </w:t>
+      </w:r>
+      <w:r>
+        <w:t xml:space="preserve">² Innodata, Robotics and Physical AI Solutions Architect</w:t>
+      </w:r>
+      <w:r>
+        <w:t xml:space="preserve"> </w:t>
+      </w:r>
+      <w:r>
+        <w:t xml:space="preserve">³ Innodata, VP Robotics and Computer Vision</w:t>
       </w:r>
     </w:p>
     <w:bookmarkStart w:id="9" w:name="abstract"/>
@@ -379,7 +391,7 @@
         <w:pStyle w:val="BodyText"/>
       </w:pPr>
       <w:r>
-        <w:t xml:space="preserve">Cosmos 3 Nano receives the first frame of the clip together with a fixed instruction, and returns a structured JSON record that defines the observed ontology. Our pipeline asks for up to ten task-relevant objects, each with a bounding box, and for each object: its role in the task, its current appearance (color, material, texture, condition, size), its current state (position, orientation, interaction with hands), and candidate variations along seven dimensions (color and appearance, material and texture, size and shape, state and position, condition, interaction, brand and style). A parallel block records scene-level variations (lighting, viewpoint, room style, time of day, clutter) and a final block states what training on this clip could miss. Reasoning takes about 130 seconds per clip on one A100.</w:t>
+        <w:t xml:space="preserve">Cosmos 3 Nano receives the first frame of the clip together with a fixed instruction, and returns a structured JSON record that defines the observed ontology (Fig. 3). Our pipeline asks for up to ten task-relevant objects, each with a bounding box, and for each object: its role in the task, its current appearance (color, material, texture, condition, size), its current state (position, orientation, interaction with hands), and candidate variations along seven dimensions (color and appearance, material and texture, size and shape, state and position, condition, interaction, brand and style). A parallel block records scene-level variations (lighting, viewpoint, room style, time of day, clutter) and a final block states what training on this clip could miss. Reasoning takes about 130 seconds per clip on one A100.</w:t>
       </w:r>
     </w:p>
     <w:bookmarkEnd w:id="21"/>

</xml_diff>

<commit_message>
oct-22 paper: text between stacked figures, Fig. 6 with the new frame, Fig. 7 to two panels
Fig. 4 and Fig. 5 both floated to the top of page 6; Fig. 5 now sits at
the bottom so the paragraph that cites both runs between them. The same
split is applied to Fig. 6 and Fig. 7 on the next page.

Fig. 6 (directional reversal) now pairs the source panel of the original
figure with oct-22/fig6.png as the second image, scaled uniformly to the
panel height (aspect ratio 1.769 before and after), not stretched.

Fig. 7 loses its third panel and is now the source desk clip beside its
blue appearance variant, at half text width; caption, the cross-
reference sentence, markdown, and alt-text.csv updated. The superseded
fig8-directional-reversal.png is removed from oct-22/figures. The paper
is now 9 pages.
</commit_message>
<xml_diff>
--- a/oct-22/AIPR 2026 Paper-oct22.docx
+++ b/oct-22/AIPR 2026 Paper-oct22.docx
@@ -755,14 +755,14 @@
       <w:r>
         <w:drawing>
           <wp:inline>
-            <wp:extent cx="5334000" cy="4536558"/>
+            <wp:extent cx="5334000" cy="2237145"/>
             <wp:effectExtent b="0" l="0" r="0" t="0"/>
-            <wp:docPr descr="Two near-identical first-person frames of hands holding a white charger cable in front of a desk and bookshelf." title="" id="32" name="Picture"/>
+            <wp:docPr descr="Two frames. Left: the source clip, hands holding a white charger cable in front of a desk and bookshelf. Right: the variant prompted to wind the cord the other way, in which the cable has become a tangled, smeared loop across the desk." title="" id="32" name="Picture"/>
             <a:graphic>
               <a:graphicData uri="http://schemas.openxmlformats.org/drawingml/2006/picture">
                 <pic:pic>
                   <pic:nvPicPr>
-                    <pic:cNvPr descr="figures/fig8-directional-reversal.png" id="33" name="Picture"/>
+                    <pic:cNvPr descr="figures/fig6-reversal-oct22.png" id="33" name="Picture"/>
                     <pic:cNvPicPr>
                       <a:picLocks noChangeArrowheads="1" noChangeAspect="1"/>
                     </pic:cNvPicPr>
@@ -776,7 +776,7 @@
                   <pic:spPr bwMode="auto">
                     <a:xfrm>
                       <a:off x="0" y="0"/>
-                      <a:ext cx="5334000" cy="4536558"/>
+                      <a:ext cx="5334000" cy="2237145"/>
                     </a:xfrm>
                     <a:prstGeom prst="rect">
                       <a:avLst/>
@@ -800,7 +800,7 @@
         <w:pStyle w:val="ImageCaption"/>
       </w:pPr>
       <w:r>
-        <w:t xml:space="preserve">Two near-identical first-person frames of hands holding a white charger cable in front of a desk and bookshelf.</w:t>
+        <w:t xml:space="preserve">Two frames. Left: the source clip, hands holding a white charger cable in front of a desk and bookshelf. Right: the variant prompted to wind the cord the other way, in which the cable has become a tangled, smeared loop across the desk.</w:t>
       </w:r>
     </w:p>
     <w:p>
@@ -820,7 +820,7 @@
         <w:pStyle w:val="BodyText"/>
       </w:pPr>
       <w:r>
-        <w:t xml:space="preserve">We did observe some limitations in this process, particularly when requesting permutations in the physics of the scene. In Fig. 6, the data collector is taking a phone charger and winding the USB cord around the wall plug in a clockwise direction (with respect to the wall plug). Next, we ask the pipeline to wind the cord in the opposite direction, counterclockwise. Surprisingly, the resulting variant was unable to maintain this ask: the spooling wire looked like spaghetti, with the cord gaining linear mass and length at times. The hands do in fact maintain the same orientation as the original video, but the variant fails to maintain the physics, violating conservation of mass and continuity. Fig. 7 places the source desk clip, its appearance variant, and the cord-winding variant side by side.</w:t>
+        <w:t xml:space="preserve">We did observe some limitations in this process, particularly when requesting permutations in the physics of the scene. In Fig. 6, the data collector is taking a phone charger and winding the USB cord around the wall plug in a clockwise direction (with respect to the wall plug). Next, we ask the pipeline to wind the cord in the opposite direction, counterclockwise. Surprisingly, the resulting variant was unable to maintain this ask: the spooling wire looked like spaghetti, with the cord gaining linear mass and length at times. The hands do in fact maintain the same orientation as the original video, but the variant fails to maintain the physics, violating conservation of mass and continuity. Fig. 7 places the source desk clip and its appearance variant side by side.</w:t>
       </w:r>
     </w:p>
     <w:p>
@@ -830,9 +830,9 @@
       <w:r>
         <w:drawing>
           <wp:inline>
-            <wp:extent cx="5334000" cy="1791937"/>
+            <wp:extent cx="5334000" cy="4476750"/>
             <wp:effectExtent b="0" l="0" r="0" t="0"/>
-            <wp:docPr descr="Three frames. Left: the source desk clip, hands holding a charger cable in front of a bookshelf. Center: the same scene with the desk and shelf objects rendered blue. Right: a wide frame of the cord-winding variant in which the cable has become a tangled, smeared loop across the desk." title="" id="35" name="Picture"/>
+            <wp:docPr descr="Two frames. Left: the source desk clip, hands holding a charger cable in front of a bookshelf. Right: the same scene with the desk and shelf objects rendered blue." title="" id="35" name="Picture"/>
             <a:graphic>
               <a:graphicData uri="http://schemas.openxmlformats.org/drawingml/2006/picture">
                 <pic:pic>
@@ -851,7 +851,7 @@
                   <pic:spPr bwMode="auto">
                     <a:xfrm>
                       <a:off x="0" y="0"/>
-                      <a:ext cx="5334000" cy="1791937"/>
+                      <a:ext cx="5334000" cy="4476750"/>
                     </a:xfrm>
                     <a:prstGeom prst="rect">
                       <a:avLst/>
@@ -875,7 +875,7 @@
         <w:pStyle w:val="ImageCaption"/>
       </w:pPr>
       <w:r>
-        <w:t xml:space="preserve">Three frames. Left: the source desk clip, hands holding a charger cable in front of a bookshelf. Center: the same scene with the desk and shelf objects rendered blue. Right: a wide frame of the cord-winding variant in which the cable has become a tangled, smeared loop across the desk.</w:t>
+        <w:t xml:space="preserve">Two frames. Left: the source desk clip, hands holding a charger cable in front of a bookshelf. Right: the same scene with the desk and shelf objects rendered blue.</w:t>
       </w:r>
     </w:p>
     <w:p>
@@ -887,7 +887,7 @@
           <w:i/>
           <w:iCs/>
         </w:rPr>
-        <w:t xml:space="preserve">Fig. 7. Variants of the desk clip: the source clip (left), an appearance variant with the desk and shelf recolored blue (center), and the cord-winding variant in which the cord loses its shape and length (right).</w:t>
+        <w:t xml:space="preserve">Fig. 7. Variants of the desk clip: the source clip (left) and an appearance variant with the desk and shelf recolored blue (right).</w:t>
       </w:r>
     </w:p>
     <w:bookmarkEnd w:id="37"/>

</xml_diff>

<commit_message>
oct-22 paper: drop "family" wording for Cosmos
Abstract: "NVIDIA Cosmos world foundation models" instead of "world
foundation models from the NVIDIA Cosmos family". Background: "three
models", as the draft originally had it, instead of "three model
families". Markdown and PDF rebuilt.
</commit_message>
<xml_diff>
--- a/oct-22/AIPR 2026 Paper-oct22.docx
+++ b/oct-22/AIPR 2026 Paper-oct22.docx
@@ -53,7 +53,7 @@
         <w:pStyle w:val="FirstParagraph"/>
       </w:pPr>
       <w:r>
-        <w:t xml:space="preserve">Training successful humanoid robotic manipulation policies within the space of Physical AI is bottlenecked by real-world data limitations in the quantity and diversity of environments. Achieving acceptable completion scores for even the most straightforward tasks may require tens of thousands of hours of training data. The training data must include sufficient diversity for different objects, surfaces, and lighting to prevent model overfitting and promote generalization. In this paper, we describe a pipeline that leverages world foundation models from the NVIDIA Cosmos family, along with large language models (LLMs) like OpenAI’s GPT-4o mini, to generate variations of real egocentric video clips while keeping the recorded actions, scaling a single video into hundreds of permutations. Our method uses NVIDIA Cosmos 3 Nano to produce an ontology of each clip: the task, each object’s role in it, and plausible variations. GPT-4o mini then writes a prompt to generate scene permutations. Our method employs traditional computer vision techniques like boundary detection and image segmentation, using Canny edge detection coupled with Segment Anything 2 (SAM 2) to locate the objects we wish to permute, while Cosmos Transfer 2.5 renders the items, maintaining realism within the video. This paper describes our process and findings, where structured reasoning about a scene produces robust, realistic permutations. We outline limitations and provide best practices for leveraging these tools, demonstrating that this powerful and economical approach is scalable when solving problems in robot learning.</w:t>
+        <w:t xml:space="preserve">Training successful humanoid robotic manipulation policies within the space of Physical AI is bottlenecked by real-world data limitations in the quantity and diversity of environments. Achieving acceptable completion scores for even the most straightforward tasks may require tens of thousands of hours of training data. The training data must include sufficient diversity for different objects, surfaces, and lighting to prevent model overfitting and promote generalization. In this paper, we describe a pipeline that leverages NVIDIA Cosmos world foundation models, along with large language models (LLMs) like OpenAI’s GPT-4o mini, to generate variations of real egocentric video clips while keeping the recorded actions, scaling a single video into hundreds of permutations. Our method uses NVIDIA Cosmos 3 Nano to produce an ontology of each clip: the task, each object’s role in it, and plausible variations. GPT-4o mini then writes a prompt to generate scene permutations. Our method employs traditional computer vision techniques like boundary detection and image segmentation, using Canny edge detection coupled with Segment Anything 2 (SAM 2) to locate the objects we wish to permute, while Cosmos Transfer 2.5 renders the items, maintaining realism within the video. This paper describes our process and findings, where structured reasoning about a scene produces robust, realistic permutations. We outline limitations and provide best practices for leveraging these tools, demonstrating that this powerful and economical approach is scalable when solving problems in robot learning.</w:t>
       </w:r>
     </w:p>
     <w:p>
@@ -130,7 +130,7 @@
         <w:pStyle w:val="FirstParagraph"/>
       </w:pPr>
       <w:r>
-        <w:t xml:space="preserve">World foundation models are large-scale artificial intelligence systems trained to understand, simulate, and predict the physical world, including how objects move, interact, and follow the laws of physics [6]. NVIDIA Cosmos consists of three model families: Predict forecasts future frames from text, an image, or a video [7]; Transfer adapts a video across environments under multi-control conditioning on depth, segmentation, edge, and blurred-RGB maps [8, 9]; Reason is a vision-language model for physical scene understanding [10]. Cosmos 3 folds the three models into one, with an autoregressive subnetwork that reasons about a scene and a diffusion-based subnetwork that generates video, audio, and actions conditioned on that reasoning [11].</w:t>
+        <w:t xml:space="preserve">World foundation models are large-scale artificial intelligence systems trained to understand, simulate, and predict the physical world, including how objects move, interact, and follow the laws of physics [6]. NVIDIA Cosmos consists of three models: Predict forecasts future frames from text, an image, or a video [7]; Transfer adapts a video across environments under multi-control conditioning on depth, segmentation, edge, and blurred-RGB maps [8, 9]; Reason is a vision-language model for physical scene understanding [10]. Cosmos 3 folds the three models into one, with an autoregressive subnetwork that reasons about a scene and a diffusion-based subnetwork that generates video, audio, and actions conditioned on that reasoning [11].</w:t>
       </w:r>
     </w:p>
     <w:bookmarkEnd w:id="10"/>

</xml_diff>

<commit_message>
oct-22 paper: introduce Cosmos Curate before the Method
Abstract: one sentence that source recordings are first split into short
clips with NVIDIA Cosmos Curate. Introduction, last paragraph: the same
step before the world foundation model reads the first frame. Background:
one sentence naming Curate as the platform's video curation pipeline,
cited to the Cosmos platform report [6], so the Method's first use of it
is not the reader's first encounter. Markdown and PDF rebuilt.
</commit_message>
<xml_diff>
--- a/oct-22/AIPR 2026 Paper-oct22.docx
+++ b/oct-22/AIPR 2026 Paper-oct22.docx
@@ -53,7 +53,7 @@
         <w:pStyle w:val="FirstParagraph"/>
       </w:pPr>
       <w:r>
-        <w:t xml:space="preserve">Training successful humanoid robotic manipulation policies within the space of Physical AI is bottlenecked by real-world data limitations in the quantity and diversity of environments. Achieving acceptable completion scores for even the most straightforward tasks may require tens of thousands of hours of training data. The training data must include sufficient diversity for different objects, surfaces, and lighting to prevent model overfitting and promote generalization. In this paper, we describe a pipeline that leverages NVIDIA Cosmos world foundation models, along with large language models (LLMs) like OpenAI’s GPT-4o mini, to generate variations of real egocentric video clips while keeping the recorded actions, scaling a single video into hundreds of permutations. Our method uses NVIDIA Cosmos 3 Nano to produce an ontology of each clip: the task, each object’s role in it, and plausible variations. GPT-4o mini then writes a prompt to generate scene permutations. Our method employs traditional computer vision techniques like boundary detection and image segmentation, using Canny edge detection coupled with Segment Anything 2 (SAM 2) to locate the objects we wish to permute, while Cosmos Transfer 2.5 renders the items, maintaining realism within the video. This paper describes our process and findings, where structured reasoning about a scene produces robust, realistic permutations. We outline limitations and provide best practices for leveraging these tools, demonstrating that this powerful and economical approach is scalable when solving problems in robot learning.</w:t>
+        <w:t xml:space="preserve">Training successful humanoid robotic manipulation policies within the space of Physical AI is bottlenecked by real-world data limitations in the quantity and diversity of environments. Achieving acceptable completion scores for even the most straightforward tasks may require tens of thousands of hours of training data. The training data must include sufficient diversity for different objects, surfaces, and lighting to prevent model overfitting and promote generalization. In this paper, we describe a pipeline that leverages NVIDIA Cosmos world foundation models, along with large language models (LLMs) like OpenAI’s GPT-4o mini, to generate variations of real egocentric video clips while keeping the recorded actions, scaling a single video into hundreds of permutations. Source recordings are first split into short clips with NVIDIA Cosmos Curate. Our method then uses NVIDIA Cosmos 3 Nano to produce an ontology of each clip: the task, each object’s role in it, and plausible variations. GPT-4o mini then writes a prompt to generate scene permutations. Our method employs traditional computer vision techniques like boundary detection and image segmentation, using Canny edge detection coupled with Segment Anything 2 (SAM 2) to locate the objects we wish to permute, while Cosmos Transfer 2.5 renders the items, maintaining realism within the video. This paper describes our process and findings, where structured reasoning about a scene produces robust, realistic permutations. We outline limitations and provide best practices for leveraging these tools, demonstrating that this powerful and economical approach is scalable when solving problems in robot learning.</w:t>
       </w:r>
     </w:p>
     <w:p>
@@ -113,7 +113,7 @@
         <w:pStyle w:val="BodyText"/>
       </w:pPr>
       <w:r>
-        <w:t xml:space="preserve">We propose a method that can effectively increase the amount of trainable data, where a world foundation model reads the first frame of an egocentric video clip and provides a structured ontology of the scene. Leveraging classical computer vision techniques, we identify the items within the ontology and permute their attributes (color, texture, location), effectively creating video variants that describe the same task but provide the diversity a policy needs to learn tasks concerning dexterous hand motions within common environments, like living rooms, kitchens, and office spaces.</w:t>
+        <w:t xml:space="preserve">We propose a method that can effectively increase the amount of trainable data. Recordings are first cut into short clips with NVIDIA Cosmos Curate, and a world foundation model then reads the first frame of each egocentric clip and provides a structured ontology of the scene. Leveraging classical computer vision techniques, we identify the items within the ontology and permute their attributes (color, texture, location), effectively creating video variants that describe the same task but provide the diversity a policy needs to learn tasks concerning dexterous hand motions within common environments, like living rooms, kitchens, and office spaces.</w:t>
       </w:r>
     </w:p>
     <w:bookmarkStart w:id="10" w:name="background"/>
@@ -130,7 +130,7 @@
         <w:pStyle w:val="FirstParagraph"/>
       </w:pPr>
       <w:r>
-        <w:t xml:space="preserve">World foundation models are large-scale artificial intelligence systems trained to understand, simulate, and predict the physical world, including how objects move, interact, and follow the laws of physics [6]. NVIDIA Cosmos consists of three models: Predict forecasts future frames from text, an image, or a video [7]; Transfer adapts a video across environments under multi-control conditioning on depth, segmentation, edge, and blurred-RGB maps [8, 9]; Reason is a vision-language model for physical scene understanding [10]. Cosmos 3 folds the three models into one, with an autoregressive subnetwork that reasons about a scene and a diffusion-based subnetwork that generates video, audio, and actions conditioned on that reasoning [11].</w:t>
+        <w:t xml:space="preserve">World foundation models are large-scale artificial intelligence systems trained to understand, simulate, and predict the physical world, including how objects move, interact, and follow the laws of physics [6]. NVIDIA Cosmos consists of three models: Predict forecasts future frames from text, an image, or a video [7]; Transfer adapts a video across environments under multi-control conditioning on depth, segmentation, edge, and blurred-RGB maps [8, 9]; Reason is a vision-language model for physical scene understanding [10]. Alongside the models, Cosmos Curate is the platform’s video curation pipeline, which splits recordings at shot boundaries and prepares clips for the models [6]. Cosmos 3 folds the three models into one, with an autoregressive subnetwork that reasons about a scene and a diffusion-based subnetwork that generates video, audio, and actions conditioned on that reasoning [11].</w:t>
       </w:r>
     </w:p>
     <w:bookmarkEnd w:id="10"/>

</xml_diff>

<commit_message>
oct-22 paper: remove stretched gaps between sections and figures
LaTeX was stretching the text to fill pages that ended in a bottom-
anchored figure, which left large gaps on pages 4 and 7. Figures 3, 5,
and 6 are now placed exactly where they stand in the source (float
package, H) and the document uses ragged bottoms, so spacing between
paragraphs and figures is the template's normal single spacing. Fig. 7
moves ahead of the reversal paragraph, directly after Fig. 6, so the
paragraph and the Closing the Gap section flow onto page 7 instead of
leaving it a quarter empty; Fig. 7 still precedes the Sec. 4 heading.
Fig. 6 is set at 0.88 of the text width. Markdown figure order matched.
</commit_message>
<xml_diff>
--- a/oct-22/AIPR 2026 Paper-oct22.docx
+++ b/oct-22/AIPR 2026 Paper-oct22.docx
@@ -817,14 +817,6 @@
     </w:p>
     <w:p>
       <w:pPr>
-        <w:pStyle w:val="BodyText"/>
-      </w:pPr>
-      <w:r>
-        <w:t xml:space="preserve">We did observe some limitations in this process, particularly when requesting permutations in the physics of the scene. In Fig. 6, the data collector is taking a phone charger and winding the USB cord around the wall plug in a clockwise direction (with respect to the wall plug). Next, we ask the pipeline to wind the cord in the opposite direction, counterclockwise. Surprisingly, the resulting variant was unable to maintain this ask: the spooling wire looked like spaghetti, with the cord gaining linear mass and length at times. The hands do in fact maintain the same orientation as the original video, but the variant fails to maintain the physics, violating conservation of mass and continuity. Fig. 7 places the source desk clip and its appearance variant side by side.</w:t>
-      </w:r>
-    </w:p>
-    <w:p>
-      <w:pPr>
         <w:pStyle w:val="CaptionedFigure"/>
       </w:pPr>
       <w:r>
@@ -888,6 +880,14 @@
           <w:iCs/>
         </w:rPr>
         <w:t xml:space="preserve">Fig. 7. Variants of the desk clip: the source clip (left) and an appearance variant with the desk and shelf recolored blue (right).</w:t>
+      </w:r>
+    </w:p>
+    <w:p>
+      <w:pPr>
+        <w:pStyle w:val="BodyText"/>
+      </w:pPr>
+      <w:r>
+        <w:t xml:space="preserve">We did observe some limitations in this process, particularly when requesting permutations in the physics of the scene. In Fig. 6, the data collector is taking a phone charger and winding the USB cord around the wall plug in a clockwise direction (with respect to the wall plug). Next, we ask the pipeline to wind the cord in the opposite direction, counterclockwise. Surprisingly, the resulting variant was unable to maintain this ask: the spooling wire looked like spaghetti, with the cord gaining linear mass and length at times. The hands do in fact maintain the same orientation as the original video, but the variant fails to maintain the physics, violating conservation of mass and continuity. Fig. 7 places the source desk clip and its appearance variant side by side.</w:t>
       </w:r>
     </w:p>
     <w:bookmarkEnd w:id="37"/>

</xml_diff>

<commit_message>
oct-22 paper: smaller ORCIDs, reversal paragraph before Fig. 7, no page gaps
ORCIDs are set as true superscripts (7 pt) instead of the class's full-
size box, matching the accepted AIPR 2025 papers; Franklin Tanner's name
no longer breaks across lines. The reversal paragraph now precedes
Fig. 7, as requested, with Fig. 6 at 0.8 of the text width, Fig. 7 at
0.36 with a one-line caption, and tighter spacing around in-place
figures, so Fig. 7 fits on page 7 after the paragraph and the Closing
the Gap heading opens page 8 with no empty space left on page 7.
9 pages. Markdown and alt-text.csv carry the shortened Fig. 7 caption.
</commit_message>
<xml_diff>
--- a/oct-22/AIPR 2026 Paper-oct22.docx
+++ b/oct-22/AIPR 2026 Paper-oct22.docx
@@ -817,6 +817,14 @@
     </w:p>
     <w:p>
       <w:pPr>
+        <w:pStyle w:val="BodyText"/>
+      </w:pPr>
+      <w:r>
+        <w:t xml:space="preserve">We did observe some limitations in this process, particularly when requesting permutations in the physics of the scene. In Fig. 6, the data collector is taking a phone charger and winding the USB cord around the wall plug in a clockwise direction (with respect to the wall plug). Next, we ask the pipeline to wind the cord in the opposite direction, counterclockwise. Surprisingly, the resulting variant was unable to maintain this ask: the spooling wire looked like spaghetti, with the cord gaining linear mass and length at times. The hands do in fact maintain the same orientation as the original video, but the variant fails to maintain the physics, violating conservation of mass and continuity. Fig. 7 places the source desk clip and its appearance variant side by side.</w:t>
+      </w:r>
+    </w:p>
+    <w:p>
+      <w:pPr>
         <w:pStyle w:val="CaptionedFigure"/>
       </w:pPr>
       <w:r>
@@ -879,15 +887,7 @@
           <w:i/>
           <w:iCs/>
         </w:rPr>
-        <w:t xml:space="preserve">Fig. 7. Variants of the desk clip: the source clip (left) and an appearance variant with the desk and shelf recolored blue (right).</w:t>
-      </w:r>
-    </w:p>
-    <w:p>
-      <w:pPr>
-        <w:pStyle w:val="BodyText"/>
-      </w:pPr>
-      <w:r>
-        <w:t xml:space="preserve">We did observe some limitations in this process, particularly when requesting permutations in the physics of the scene. In Fig. 6, the data collector is taking a phone charger and winding the USB cord around the wall plug in a clockwise direction (with respect to the wall plug). Next, we ask the pipeline to wind the cord in the opposite direction, counterclockwise. Surprisingly, the resulting variant was unable to maintain this ask: the spooling wire looked like spaghetti, with the cord gaining linear mass and length at times. The hands do in fact maintain the same orientation as the original video, but the variant fails to maintain the physics, violating conservation of mass and continuity. Fig. 7 places the source desk clip and its appearance variant side by side.</w:t>
+        <w:t xml:space="preserve">Fig. 7. Desk clip: source (left) and appearance variant with desk and shelf recolored blue (right).</w:t>
       </w:r>
     </w:p>
     <w:bookmarkEnd w:id="37"/>

</xml_diff>